<commit_message>
Make project covers and titles clickable; refine creative identity, hero and resumes
</commit_message>
<xml_diff>
--- a/assets/curriculo-maria-helena.docx
+++ b/assets/curriculo-maria-helena.docx
@@ -69,6 +69,17 @@
           <w:rtl w:val="0"/>
         </w:rPr>
       </w:r>
+      <w:r>
+        <w:rPr>
+          <w:rFonts w:ascii="Calibri" w:cs="Calibri" w:eastAsia="Calibri" w:hAnsi="Calibri"/>
+          <w:color w:val="3a3a36"/>
+          <w:sz w:val="18"/>
+          <w:szCs w:val="18"/>
+          <w:rtl w:val="0"/>
+        </w:rPr>
+        <w:br/>
+        <w:t>Portfólio: https://ninaspaniak-hub.github.io/</w:t>
+      </w:r>
     </w:p>
     <w:p>
       <w:pPr>
@@ -124,7 +135,7 @@
           <w:color w:val="3a3a36"/>
           <w:rtl w:val="0"/>
         </w:rPr>
-        <w:t xml:space="preserve">Escrevo, crio, reviso, planejo e organizo ideias para transformar informação em comunicação clara, útil e humanizada. Meu trabalho combina pesquisa, produção criativa, planejamento estratégico e análise. Tenho facilidade para me adaptar a diferentes formatos, contextos e objetivos, unindo olhar técnico, criativo e analítico para construir textos e conteúdos que façam sentido para quem lê, para a marca e para o canal em que aparecem.</w:t>
+        <w:t>Escrevo, crio, reviso, planejo e organizo ideias para transformar informação em comunicação clara, útil e humanizada. Sou uma comunicadora que combina pesquisa, planejamento, criação e análise. Adapto linguagem, formato e tom a diferentes públicos, marcas e canais. Minha criatividade também está na concepção de processos, ferramentas e soluções: identifico necessidades e desenvolvo caminhos com método e experimentação, incluindo projetos com desenvolvimento assistido por IA.</w:t>
       </w:r>
     </w:p>
     <w:p>
@@ -203,7 +214,7 @@
           <w:szCs w:val="20"/>
           <w:rtl w:val="0"/>
         </w:rPr>
-        <w:t xml:space="preserve">Redatora e Editora de Textos I</w:t>
+        <w:t>Redatora e Editora de Textos</w:t>
       </w:r>
       <w:r>
         <w:rPr>

</xml_diff>